<commit_message>
Añadir Figura 1: fotografía del vehículo, y renumerar figuras
La foto del carrito va en la sección del hardware como Figura 1; las
capturas del panel pasan a ser Figuras 2-5 y la curva final, Figura 6.
Todas las figuras quedan citadas en el texto.

Co-Authored-By: Claude Fable 5 <noreply@anthropic.com>
Claude-Session: https://claude.ai/code/session_017dyiKcteTE4bQwTv9N1uhd
</commit_message>
<xml_diff>
--- a/docs/Informe_Final_MARS-ROBOT.docx
+++ b/docs/Informe_Final_MARS-ROBOT.docx
@@ -196,7 +196,38 @@
         <w:jc w:val="both"/>
       </w:pPr>
       <w:r>
-        <w:t>El mBot2 de Makeblock es un vehículo educativo compuesto por tres elementos: el controlador CyberPi, el escudo (shield) mBot2 y el chasis con dos ruedas motrices. El CyberPi integra un microcontrolador ESP32 con conectividad Wi-Fi y Bluetooth, una pantalla a color de 1,44 pulgadas, botones y una palanca de navegación, micrófono, altavoz, sensor de luz ambiente y una unidad de medición inercial (IMU) de seis ejes. El shield mBot2 aporta la batería principal de los motores (celda de litio de 2500 mAh), los puertos EM1 y EM2 para los motores con encoder y puertos de extensión con entradas y salidas digitales y analógicas. Los módulos externos, como el sensor de línea Quad RGB, se conectan en cadena mediante el sistema mBuild. El programa del robot se escribe en MicroPython y se ejecuta en modo de carga (Upload), es decir, dentro del propio dispositivo; esta decisión se fundamenta en la sección de diseño.</w:t>
+        <w:t>El mBot2 de Makeblock es un vehículo educativo compuesto por tres elementos: el controlador CyberPi, el escudo (shield) mBot2 y el chasis con dos ruedas motrices. El CyberPi integra un microcontrolador ESP32 con conectividad Wi-Fi y Bluetooth, una pantalla a color de 1,44 pulgadas, botones y una palanca de navegación, micrófono, altavoz, sensor de luz ambiente y una unidad de medición inercial (IMU) de seis ejes. El shield mBot2 aporta la batería principal de los motores (celda de litio de 2500 mAh), los puertos EM1 y EM2 para los motores con encoder y puertos de extensión con entradas y salidas digitales y analógicas. Los módulos externos, como el sensor de línea Quad RGB, se conectan en cadena mediante el sistema mBuild. El programa del robot se escribe en MicroPython y se ejecuta en modo de carga (Upload), es decir, dentro del propio dispositivo; esta decisión se fundamenta en la sección de diseño. La Figura 1 muestra el vehículo utilizado en el proyecto.</w:t>
+      </w:r>
+    </w:p>
+    <w:p>
+      <w:pPr>
+        <w:spacing w:line="480" w:lineRule="auto"/>
+      </w:pPr>
+      <w:r>
+        <w:rPr>
+          <w:b/>
+        </w:rPr>
+        <w:t>Figura 1</w:t>
+      </w:r>
+    </w:p>
+    <w:p>
+      <w:r>
+        <w:rPr>
+          <w:i/>
+        </w:rPr>
+        <w:t>Vehículo mBot2 del proyecto MARS-ROBOT, con el controlador CyberPi, el sensor de línea Quad RGB y el chasis con motores de encoder.</w:t>
+      </w:r>
+    </w:p>
+    <w:p>
+      <w:pPr>
+        <w:jc w:val="center"/>
+      </w:pPr>
+      <w:r>
+        <w:rPr>
+          <w:b/>
+          <w:color w:val="C03B3B"/>
+        </w:rPr>
+        <w:t>[ INSERTAR CAPTURA 1 AQUÍ — fotografía del carrito (vista donde se aprecien el CyberPi y el sensor de línea) ]</w:t>
       </w:r>
     </w:p>
     <w:p>
@@ -3451,7 +3482,7 @@
         <w:jc w:val="both"/>
       </w:pPr>
       <w:r>
-        <w:t>El panel es una aplicación web de una sola página con tres secciones: Inicio, con la presentación del proyecto (Figura 1); Panel en vivo, con los indicadores y gráficos; y Datos, con la tabla de muestras, la guía del formato y la descarga del CSV. La captura se controla desde la propia interfaz, que guía al usuario en cada paso del procedimiento descrito y señala los errores frecuentes, como el puerto ocupado por mBlock.</w:t>
+        <w:t>El panel es una aplicación web de una sola página con tres secciones: Inicio, con la presentación del proyecto (Figura 2); Panel en vivo, con los indicadores y gráficos; y Datos, con la tabla de muestras, la guía del formato y la descarga del CSV. La captura se controla desde la propia interfaz, que guía al usuario en cada paso del procedimiento descrito y señala los errores frecuentes, como el puerto ocupado por mBlock.</w:t>
       </w:r>
     </w:p>
     <w:p>
@@ -3462,7 +3493,7 @@
         <w:rPr>
           <w:b/>
         </w:rPr>
-        <w:t>Figura 1</w:t>
+        <w:t>Figura 2</w:t>
       </w:r>
     </w:p>
     <w:p>
@@ -3482,7 +3513,7 @@
           <w:b/>
           <w:color w:val="C03B3B"/>
         </w:rPr>
-        <w:t>[ INSERTAR CAPTURA 1 AQUÍ — sección «Inicio» del panel en el navegador ]</w:t>
+        <w:t>[ INSERTAR CAPTURA 2 AQUÍ — sección «Inicio» del panel en el navegador ]</w:t>
       </w:r>
     </w:p>
     <w:p>
@@ -3491,7 +3522,7 @@
         <w:jc w:val="both"/>
       </w:pPr>
       <w:r>
-        <w:t>El panel en vivo (Figura 2) muestra seis indicadores —tiempo de captura, batería, velocidad, distancia, inclinación y estado del sensor de línea— y cinco gráficos sincronizados: velocidad de ambas ruedas, inclinación (roll y pitch), voltaje, franja de estado del seguidor codificada por colores y el diagrama de velocidad según inclinación. Una barra de ventana temporal permite examinar los últimos 30 s, 60 s, 2 min o la captura completa, y todos los gráficos disponen de cursor de inspección con los valores exactos de cada muestra.</w:t>
+        <w:t>El panel en vivo (Figura 3) muestra seis indicadores —tiempo de captura, batería, velocidad, distancia, inclinación y estado del sensor de línea— y cinco gráficos sincronizados: velocidad de ambas ruedas, inclinación (roll y pitch), voltaje, franja de estado del seguidor codificada por colores y el diagrama de velocidad según inclinación. Una barra de ventana temporal permite examinar los últimos 30 s, 60 s, 2 min o la captura completa, y todos los gráficos disponen de cursor de inspección con los valores exactos de cada muestra.</w:t>
       </w:r>
     </w:p>
     <w:p>
@@ -3502,7 +3533,7 @@
         <w:rPr>
           <w:b/>
         </w:rPr>
-        <w:t>Figura 2</w:t>
+        <w:t>Figura 3</w:t>
       </w:r>
     </w:p>
     <w:p>
@@ -3522,7 +3553,7 @@
           <w:b/>
           <w:color w:val="C03B3B"/>
         </w:rPr>
-        <w:t>[ INSERTAR CAPTURA 2 AQUÍ — sección «Panel en vivo» con una captura en curso ]</w:t>
+        <w:t>[ INSERTAR CAPTURA 3 AQUÍ — sección «Panel en vivo» con una captura en curso ]</w:t>
       </w:r>
     </w:p>
     <w:p>
@@ -3531,7 +3562,7 @@
         <w:jc w:val="both"/>
       </w:pPr>
       <w:r>
-        <w:t>El diagrama de velocidad según inclinación (Figura 3) es el instrumento central del proyecto: cada muestra se ubica por su cabeceo (pitch) y su velocidad, y una curva de promedios por tramos de 2° resume la tendencia. La inclinación a la cual esa curva cae hacia cero corresponde a la pendiente máxima superable. El panel advierte de forma automática cuando las muestras provienen de la velocidad comandada (encoder inactivo), caso en el que la curva aún no refleja la pérdida real de fuerza.</w:t>
+        <w:t>El diagrama de velocidad según inclinación (Figura 4) es el instrumento central del proyecto: cada muestra se ubica por su cabeceo (pitch) y su velocidad, y una curva de promedios por tramos de 2° resume la tendencia. La inclinación a la cual esa curva cae hacia cero corresponde a la pendiente máxima superable. El panel advierte de forma automática cuando las muestras provienen de la velocidad comandada (encoder inactivo), caso en el que la curva aún no refleja la pérdida real de fuerza. La sección Datos del panel (Figura 5) completa la interfaz con la tabla de muestras, la guía del formato y la descarga del CSV.</w:t>
       </w:r>
     </w:p>
     <w:p>
@@ -3542,7 +3573,7 @@
         <w:rPr>
           <w:b/>
         </w:rPr>
-        <w:t>Figura 3</w:t>
+        <w:t>Figura 4</w:t>
       </w:r>
     </w:p>
     <w:p>
@@ -3562,7 +3593,7 @@
           <w:b/>
           <w:color w:val="C03B3B"/>
         </w:rPr>
-        <w:t>[ INSERTAR CAPTURA 3 AQUÍ — gráfico «Velocidad según inclinación» con datos ]</w:t>
+        <w:t>[ INSERTAR CAPTURA 4 AQUÍ — gráfico «Velocidad según inclinación» con datos ]</w:t>
       </w:r>
     </w:p>
     <w:p>
@@ -3573,7 +3604,7 @@
         <w:rPr>
           <w:b/>
         </w:rPr>
-        <w:t>Figura 4</w:t>
+        <w:t>Figura 5</w:t>
       </w:r>
     </w:p>
     <w:p>
@@ -3593,7 +3624,7 @@
           <w:b/>
           <w:color w:val="C03B3B"/>
         </w:rPr>
-        <w:t>[ INSERTAR CAPTURA 4 AQUÍ — sección «Datos» del panel ]</w:t>
+        <w:t>[ INSERTAR CAPTURA 5 AQUÍ — sección «Datos» del panel ]</w:t>
       </w:r>
     </w:p>
     <w:p>
@@ -4125,7 +4156,7 @@
         <w:jc w:val="both"/>
       </w:pPr>
       <w:r>
-        <w:t>La Tabla 5 presenta los resultados por nivel de inclinación y la Figura 5 la curva velocidad–inclinación obtenida.</w:t>
+        <w:t>La Tabla 5 presenta los resultados por nivel de inclinación y la Figura 6 la curva velocidad–inclinación obtenida.</w:t>
       </w:r>
     </w:p>
     <w:p>
@@ -4806,7 +4837,7 @@
         <w:rPr>
           <w:b/>
         </w:rPr>
-        <w:t>Figura 5</w:t>
+        <w:t>Figura 6</w:t>
       </w:r>
     </w:p>
     <w:p>
@@ -4826,7 +4857,7 @@
           <w:b/>
           <w:color w:val="C03B3B"/>
         </w:rPr>
-        <w:t>[ INSERTAR CAPTURA 5 AQUÍ — gráfico «Velocidad según inclinación» al terminar la campaña final ]</w:t>
+        <w:t>[ INSERTAR CAPTURA 6 AQUÍ — gráfico «Velocidad según inclinación» al terminar la campaña final ]</w:t>
       </w:r>
     </w:p>
     <w:p>

</xml_diff>

<commit_message>
Inicio con título oficial, integrantes y escudo de la UNSA
- Título del hero: "MARS-ROBOT: Sistema de Captación de Datos del
  Recorrido de un Vehículo sobre una Plataforma de Inclinación Variable"
- Sección Equipo con los 4 integrantes
- Escudo de la UNSA incrustado en base64 (funciona sin internet)
- Portada del informe final con el título oficial y los autores
- README con los integrantes

Co-Authored-By: Claude Fable 5 <noreply@anthropic.com>
Claude-Session: https://claude.ai/code/session_017dyiKcteTE4bQwTv9N1uhd
</commit_message>
<xml_diff>
--- a/docs/Informe_Final_MARS-ROBOT.docx
+++ b/docs/Informe_Final_MARS-ROBOT.docx
@@ -16,7 +16,7 @@
         <w:rPr>
           <w:b/>
         </w:rPr>
-        <w:t>Sistema de Captación y Análisis de Datos de un Vehículo mBot2 sobre Terreno de Inclinación Variable: Proyecto MARS-ROBOT</w:t>
+        <w:t>MARS-ROBOT: Sistema de Captación de Datos del Recorrido de un Vehículo sobre una Plataforma de Inclinación Variable</w:t>
       </w:r>
     </w:p>
     <w:p/>
@@ -28,7 +28,18 @@
         <w:rPr>
           <w:b w:val="0"/>
         </w:rPr>
-        <w:t>Equipo MARS-ROBOT</w:t>
+        <w:t>Usiel Suriel Quispe Puma, Kennedy Chirinos Rojas,</w:t>
+      </w:r>
+    </w:p>
+    <w:p>
+      <w:pPr>
+        <w:jc w:val="center"/>
+      </w:pPr>
+      <w:r>
+        <w:rPr>
+          <w:b w:val="0"/>
+        </w:rPr>
+        <w:t>Jerry Anderson Huaynacho Mango y Flor de Liz Velazque Quispe</w:t>
       </w:r>
     </w:p>
     <w:p>
@@ -150,7 +161,7 @@
         <w:rPr>
           <w:b/>
         </w:rPr>
-        <w:t>Sistema de Captación y Análisis de Datos de un Vehículo mBot2 sobre Terreno de Inclinación Variable</w:t>
+        <w:t>MARS-ROBOT: Sistema de Captación de Datos del Recorrido de un Vehículo sobre una Plataforma de Inclinación Variable</w:t>
       </w:r>
     </w:p>
     <w:p>

</xml_diff>